<commit_message>
Week 4: final per-item scripts and testing docs
Replaces the earlier combined versions in Week4-Procs-Indexes with the files
actually submitted to Canvas: one script + testing doc per item, teammates'
procs kept as written apart from the required fixes, no file-level header
banners, and the Item 3 TESTING section made safe to run whole or one
statement at a time. Each member's original files stay in their own folder.
</commit_message>
<xml_diff>
--- a/Week4-Procs-Indexes/Week4_Item1_StoredProcedures_Testing.docx
+++ b/Week4-Procs-Indexes/Week4_Item1_StoredProcedures_Testing.docx
@@ -676,7 +676,18 @@
           <w:rFonts w:ascii="Consolas" w:hAnsi="Consolas"/>
           <w:sz w:val="18"/>
         </w:rPr>
-        <w:t>CREATE PROCEDURE spN_RecipeDetails</w:t>
+        <w:t>CREATE PROC spN_RecipeDetails</w:t>
+      </w:r>
+    </w:p>
+    <w:p>
+      <w:pPr>
+        <w:spacing w:after="0" w:before="0"/>
+      </w:pPr>
+      <w:r>
+        <w:rPr>
+          <w:rFonts w:ascii="Consolas" w:hAnsi="Consolas"/>
+          <w:sz w:val="18"/>
+        </w:rPr>
       </w:r>
     </w:p>
     <w:p>
@@ -700,7 +711,6 @@
           <w:rFonts w:ascii="Consolas" w:hAnsi="Consolas"/>
           <w:sz w:val="18"/>
         </w:rPr>
-        <w:t>BEGIN</w:t>
       </w:r>
     </w:p>
     <w:p>
@@ -712,7 +722,7 @@
           <w:rFonts w:ascii="Consolas" w:hAnsi="Consolas"/>
           <w:sz w:val="18"/>
         </w:rPr>
-        <w:t xml:space="preserve">    SET NOCOUNT ON;</w:t>
+        <w:t>SELECT DishID, IngredientName, FORMAT(SUM(IngredientCost * QuantityUsed), 'C', 'en-IE') AS RecipeCost</w:t>
       </w:r>
     </w:p>
     <w:p>
@@ -724,6 +734,7 @@
           <w:rFonts w:ascii="Consolas" w:hAnsi="Consolas"/>
           <w:sz w:val="18"/>
         </w:rPr>
+        <w:t>FROM Recipes r</w:t>
       </w:r>
     </w:p>
     <w:p>
@@ -735,7 +746,7 @@
           <w:rFonts w:ascii="Consolas" w:hAnsi="Consolas"/>
           <w:sz w:val="18"/>
         </w:rPr>
-        <w:t xml:space="preserve">    SELECT DishID, IngredientName,</w:t>
+        <w:t xml:space="preserve">    JOIN Ingredients i</w:t>
       </w:r>
     </w:p>
     <w:p>
@@ -747,7 +758,7 @@
           <w:rFonts w:ascii="Consolas" w:hAnsi="Consolas"/>
           <w:sz w:val="18"/>
         </w:rPr>
-        <w:t xml:space="preserve">        FORMAT(SUM(IngredientCost * QuantityUsed), 'C', 'en-IE') AS RecipeCost</w:t>
+        <w:t xml:space="preserve">        ON r.IngredientID = i.IngredientID</w:t>
       </w:r>
     </w:p>
     <w:p>
@@ -759,7 +770,7 @@
           <w:rFonts w:ascii="Consolas" w:hAnsi="Consolas"/>
           <w:sz w:val="18"/>
         </w:rPr>
-        <w:t xml:space="preserve">    FROM Recipes r</w:t>
+        <w:t>GROUP BY ROLLUP(DishID, IngredientName)</w:t>
       </w:r>
     </w:p>
     <w:p>
@@ -771,55 +782,7 @@
           <w:rFonts w:ascii="Consolas" w:hAnsi="Consolas"/>
           <w:sz w:val="18"/>
         </w:rPr>
-        <w:t xml:space="preserve">        JOIN Ingredients i</w:t>
-      </w:r>
-    </w:p>
-    <w:p>
-      <w:pPr>
-        <w:spacing w:after="0" w:before="0"/>
-      </w:pPr>
-      <w:r>
-        <w:rPr>
-          <w:rFonts w:ascii="Consolas" w:hAnsi="Consolas"/>
-          <w:sz w:val="18"/>
-        </w:rPr>
-        <w:t xml:space="preserve">            ON r.IngredientID = i.IngredientID</w:t>
-      </w:r>
-    </w:p>
-    <w:p>
-      <w:pPr>
-        <w:spacing w:after="0" w:before="0"/>
-      </w:pPr>
-      <w:r>
-        <w:rPr>
-          <w:rFonts w:ascii="Consolas" w:hAnsi="Consolas"/>
-          <w:sz w:val="18"/>
-        </w:rPr>
-        <w:t xml:space="preserve">    GROUP BY ROLLUP(DishID, IngredientName)</w:t>
-      </w:r>
-    </w:p>
-    <w:p>
-      <w:pPr>
-        <w:spacing w:after="0" w:before="0"/>
-      </w:pPr>
-      <w:r>
-        <w:rPr>
-          <w:rFonts w:ascii="Consolas" w:hAnsi="Consolas"/>
-          <w:sz w:val="18"/>
-        </w:rPr>
-        <w:t xml:space="preserve">    ORDER BY DishID;</w:t>
-      </w:r>
-    </w:p>
-    <w:p>
-      <w:pPr>
-        <w:spacing w:after="0" w:before="0"/>
-      </w:pPr>
-      <w:r>
-        <w:rPr>
-          <w:rFonts w:ascii="Consolas" w:hAnsi="Consolas"/>
-          <w:sz w:val="18"/>
-        </w:rPr>
-        <w:t>END;</w:t>
+        <w:t>ORDER BY DishID</w:t>
       </w:r>
     </w:p>
     <w:p/>
@@ -846,11 +809,38 @@
         <w:jc w:val="center"/>
       </w:pPr>
       <w:r>
-        <w:rPr>
-          <w:b w:val="0"/>
-          <w:i/>
-        </w:rPr>
-        <w:t>[ screenshot 1b_recipes.png goes here ]</w:t>
+        <w:drawing>
+          <wp:inline xmlns:a="http://schemas.openxmlformats.org/drawingml/2006/main" xmlns:pic="http://schemas.openxmlformats.org/drawingml/2006/picture">
+            <wp:extent cx="3657600" cy="5238307"/>
+            <wp:docPr id="2" name="Picture 2"/>
+            <wp:cNvGraphicFramePr>
+              <a:graphicFrameLocks noChangeAspect="1"/>
+            </wp:cNvGraphicFramePr>
+            <a:graphic>
+              <a:graphicData uri="http://schemas.openxmlformats.org/drawingml/2006/picture">
+                <pic:pic>
+                  <pic:nvPicPr>
+                    <pic:cNvPr id="0" name="1b_recipes.png"/>
+                    <pic:cNvPicPr/>
+                  </pic:nvPicPr>
+                  <pic:blipFill>
+                    <a:blip r:embed="rId10"/>
+                    <a:stretch>
+                      <a:fillRect/>
+                    </a:stretch>
+                  </pic:blipFill>
+                  <pic:spPr>
+                    <a:xfrm>
+                      <a:off x="0" y="0"/>
+                      <a:ext cx="3657600" cy="5238307"/>
+                    </a:xfrm>
+                    <a:prstGeom prst="rect"/>
+                  </pic:spPr>
+                </pic:pic>
+              </a:graphicData>
+            </a:graphic>
+          </wp:inline>
+        </w:drawing>
       </w:r>
     </w:p>
     <w:p>
@@ -886,7 +876,7 @@
           <w:b w:val="0"/>
           <w:i w:val="0"/>
         </w:rPr>
-        <w:t>Each dish, each ingredient in its recipe, and the menu price of the dish.</w:t>
+        <w:t>Each dish, each ingredient in its recipe, and the menu price of the dish itself.</w:t>
       </w:r>
     </w:p>
     <w:p>
@@ -898,7 +888,18 @@
           <w:rFonts w:ascii="Consolas" w:hAnsi="Consolas"/>
           <w:sz w:val="18"/>
         </w:rPr>
-        <w:t>CREATE PROCEDURE spN_DishDetails</w:t>
+        <w:t>CREATE PROC spN_DishDetails</w:t>
+      </w:r>
+    </w:p>
+    <w:p>
+      <w:pPr>
+        <w:spacing w:after="0" w:before="0"/>
+      </w:pPr>
+      <w:r>
+        <w:rPr>
+          <w:rFonts w:ascii="Consolas" w:hAnsi="Consolas"/>
+          <w:sz w:val="18"/>
+        </w:rPr>
       </w:r>
     </w:p>
     <w:p>
@@ -922,7 +923,6 @@
           <w:rFonts w:ascii="Consolas" w:hAnsi="Consolas"/>
           <w:sz w:val="18"/>
         </w:rPr>
-        <w:t>BEGIN</w:t>
       </w:r>
     </w:p>
     <w:p>
@@ -934,7 +934,7 @@
           <w:rFonts w:ascii="Consolas" w:hAnsi="Consolas"/>
           <w:sz w:val="18"/>
         </w:rPr>
-        <w:t xml:space="preserve">    SET NOCOUNT ON;</w:t>
+        <w:t>SELECT r.DishID, d.DishName, r.IngredientID, IngredientName, FORMAT(Price, 'C', 'en-IE') AS DishCost</w:t>
       </w:r>
     </w:p>
     <w:p>
@@ -946,6 +946,7 @@
           <w:rFonts w:ascii="Consolas" w:hAnsi="Consolas"/>
           <w:sz w:val="18"/>
         </w:rPr>
+        <w:t>FROM Dishes d</w:t>
       </w:r>
     </w:p>
     <w:p>
@@ -957,7 +958,7 @@
           <w:rFonts w:ascii="Consolas" w:hAnsi="Consolas"/>
           <w:sz w:val="18"/>
         </w:rPr>
-        <w:t xml:space="preserve">    SELECT r.DishID, d.DishName, r.IngredientID, IngredientName,</w:t>
+        <w:t xml:space="preserve">    JOIN Recipes r</w:t>
       </w:r>
     </w:p>
     <w:p>
@@ -969,7 +970,7 @@
           <w:rFonts w:ascii="Consolas" w:hAnsi="Consolas"/>
           <w:sz w:val="18"/>
         </w:rPr>
-        <w:t xml:space="preserve">        FORMAT(Price, 'C', 'en-IE') AS DishCost</w:t>
+        <w:t xml:space="preserve">        ON d.DishID = r.DishID</w:t>
       </w:r>
     </w:p>
     <w:p>
@@ -981,7 +982,7 @@
           <w:rFonts w:ascii="Consolas" w:hAnsi="Consolas"/>
           <w:sz w:val="18"/>
         </w:rPr>
-        <w:t xml:space="preserve">    FROM Dishes d</w:t>
+        <w:t xml:space="preserve">    JOIN Ingredients i</w:t>
       </w:r>
     </w:p>
     <w:p>
@@ -993,7 +994,7 @@
           <w:rFonts w:ascii="Consolas" w:hAnsi="Consolas"/>
           <w:sz w:val="18"/>
         </w:rPr>
-        <w:t xml:space="preserve">        JOIN Recipes r</w:t>
+        <w:t xml:space="preserve">        ON i.IngredientID = r.IngredientID</w:t>
       </w:r>
     </w:p>
     <w:p>
@@ -1005,55 +1006,7 @@
           <w:rFonts w:ascii="Consolas" w:hAnsi="Consolas"/>
           <w:sz w:val="18"/>
         </w:rPr>
-        <w:t xml:space="preserve">            ON d.DishID = r.DishID</w:t>
-      </w:r>
-    </w:p>
-    <w:p>
-      <w:pPr>
-        <w:spacing w:after="0" w:before="0"/>
-      </w:pPr>
-      <w:r>
-        <w:rPr>
-          <w:rFonts w:ascii="Consolas" w:hAnsi="Consolas"/>
-          <w:sz w:val="18"/>
-        </w:rPr>
-        <w:t xml:space="preserve">        JOIN Ingredients i</w:t>
-      </w:r>
-    </w:p>
-    <w:p>
-      <w:pPr>
-        <w:spacing w:after="0" w:before="0"/>
-      </w:pPr>
-      <w:r>
-        <w:rPr>
-          <w:rFonts w:ascii="Consolas" w:hAnsi="Consolas"/>
-          <w:sz w:val="18"/>
-        </w:rPr>
-        <w:t xml:space="preserve">            ON i.IngredientID = r.IngredientID</w:t>
-      </w:r>
-    </w:p>
-    <w:p>
-      <w:pPr>
-        <w:spacing w:after="0" w:before="0"/>
-      </w:pPr>
-      <w:r>
-        <w:rPr>
-          <w:rFonts w:ascii="Consolas" w:hAnsi="Consolas"/>
-          <w:sz w:val="18"/>
-        </w:rPr>
-        <w:t xml:space="preserve">    ORDER BY r.DishID, r.IngredientID;</w:t>
-      </w:r>
-    </w:p>
-    <w:p>
-      <w:pPr>
-        <w:spacing w:after="0" w:before="0"/>
-      </w:pPr>
-      <w:r>
-        <w:rPr>
-          <w:rFonts w:ascii="Consolas" w:hAnsi="Consolas"/>
-          <w:sz w:val="18"/>
-        </w:rPr>
-        <w:t>END;</w:t>
+        <w:t>GROUP BY r.DishID, d.DishName, r.IngredientID, IngredientName, Price</w:t>
       </w:r>
     </w:p>
     <w:p/>
@@ -1083,7 +1036,7 @@
         <w:drawing>
           <wp:inline xmlns:a="http://schemas.openxmlformats.org/drawingml/2006/main" xmlns:pic="http://schemas.openxmlformats.org/drawingml/2006/picture">
             <wp:extent cx="4572000" cy="2574918"/>
-            <wp:docPr id="2" name="Picture 2"/>
+            <wp:docPr id="3" name="Picture 3"/>
             <wp:cNvGraphicFramePr>
               <a:graphicFrameLocks noChangeAspect="1"/>
             </wp:cNvGraphicFramePr>
@@ -1095,7 +1048,7 @@
                     <pic:cNvPicPr/>
                   </pic:nvPicPr>
                   <pic:blipFill>
-                    <a:blip r:embed="rId10"/>
+                    <a:blip r:embed="rId11"/>
                     <a:stretch>
                       <a:fillRect/>
                     </a:stretch>
@@ -1171,7 +1124,7 @@
           <w:rFonts w:ascii="Consolas" w:hAnsi="Consolas"/>
           <w:sz w:val="18"/>
         </w:rPr>
-        <w:t xml:space="preserve">    @LeadChef INT = NULL</w:t>
+        <w:t xml:space="preserve">    @LeadChef int = NULL</w:t>
       </w:r>
     </w:p>
     <w:p>
@@ -1243,7 +1196,7 @@
           <w:rFonts w:ascii="Consolas" w:hAnsi="Consolas"/>
           <w:sz w:val="18"/>
         </w:rPr>
-        <w:t xml:space="preserve">        WHERE @LeadChef IS NULL OR @LeadChef = LeadChef;</w:t>
+        <w:t xml:space="preserve">        WHERE @LeadChef IS NULL OR @LeadChef = LeadChef</w:t>
       </w:r>
     </w:p>
     <w:p>
@@ -1291,7 +1244,7 @@
           <w:rFonts w:ascii="Consolas" w:hAnsi="Consolas"/>
           <w:sz w:val="18"/>
         </w:rPr>
-        <w:t xml:space="preserve">            CONVERT(varchar, @LeadChef, 1) + '.';</w:t>
+        <w:t xml:space="preserve">            CONVERT(varchar, @LeadChef, 1) + '.'</w:t>
       </w:r>
     </w:p>
     <w:p>
@@ -1345,7 +1298,7 @@
         <w:drawing>
           <wp:inline xmlns:a="http://schemas.openxmlformats.org/drawingml/2006/main" xmlns:pic="http://schemas.openxmlformats.org/drawingml/2006/picture">
             <wp:extent cx="5943600" cy="1037504"/>
-            <wp:docPr id="3" name="Picture 3"/>
+            <wp:docPr id="4" name="Picture 4"/>
             <wp:cNvGraphicFramePr>
               <a:graphicFrameLocks noChangeAspect="1"/>
             </wp:cNvGraphicFramePr>
@@ -1357,7 +1310,7 @@
                     <pic:cNvPicPr/>
                   </pic:nvPicPr>
                   <pic:blipFill>
-                    <a:blip r:embed="rId11"/>
+                    <a:blip r:embed="rId12"/>
                     <a:stretch>
                       <a:fillRect/>
                     </a:stretch>
@@ -1412,7 +1365,7 @@
         <w:drawing>
           <wp:inline xmlns:a="http://schemas.openxmlformats.org/drawingml/2006/main" xmlns:pic="http://schemas.openxmlformats.org/drawingml/2006/picture">
             <wp:extent cx="5943600" cy="468671"/>
-            <wp:docPr id="4" name="Picture 4"/>
+            <wp:docPr id="5" name="Picture 5"/>
             <wp:cNvGraphicFramePr>
               <a:graphicFrameLocks noChangeAspect="1"/>
             </wp:cNvGraphicFramePr>
@@ -1424,7 +1377,7 @@
                     <pic:cNvPicPr/>
                   </pic:nvPicPr>
                   <pic:blipFill>
-                    <a:blip r:embed="rId12"/>
+                    <a:blip r:embed="rId13"/>
                     <a:stretch>
                       <a:fillRect/>
                     </a:stretch>
@@ -1476,7 +1429,7 @@
           <w:b w:val="0"/>
           <w:i w:val="0"/>
         </w:rPr>
-        <w:t>Returns the customers with a formatted name. The @CustomerID parameter is optional; with nothing passed it lists all 100 customers, with an ID it returns that one customer.</w:t>
+        <w:t>Returns the customers with a formatted name to make it a bit more neat. The @CustomerID parameter is optional; with nothing passed it lists all 100 customers, with an ID it returns that one customer.</w:t>
       </w:r>
     </w:p>
     <w:p>
@@ -1488,7 +1441,7 @@
           <w:rFonts w:ascii="Consolas" w:hAnsi="Consolas"/>
           <w:sz w:val="18"/>
         </w:rPr>
-        <w:t>CREATE PROCEDURE spN_CustomerDetails</w:t>
+        <w:t>CREATE PROC spN_CustomerDetails</w:t>
       </w:r>
     </w:p>
     <w:p>
@@ -1524,7 +1477,6 @@
           <w:rFonts w:ascii="Consolas" w:hAnsi="Consolas"/>
           <w:sz w:val="18"/>
         </w:rPr>
-        <w:t>BEGIN</w:t>
       </w:r>
     </w:p>
     <w:p>
@@ -1536,7 +1488,7 @@
           <w:rFonts w:ascii="Consolas" w:hAnsi="Consolas"/>
           <w:sz w:val="18"/>
         </w:rPr>
-        <w:t xml:space="preserve">    SET NOCOUNT ON;</w:t>
+        <w:t>SELECT FirstName + ' ' + LastName AS CustName, Email, PhoneNumber,</w:t>
       </w:r>
     </w:p>
     <w:p>
@@ -1548,6 +1500,7 @@
           <w:rFonts w:ascii="Consolas" w:hAnsi="Consolas"/>
           <w:sz w:val="18"/>
         </w:rPr>
+        <w:t xml:space="preserve">    PreferredTable, PreferredServer, PreferredRes, PreferredOrder,</w:t>
       </w:r>
     </w:p>
     <w:p>
@@ -1559,7 +1512,7 @@
           <w:rFonts w:ascii="Consolas" w:hAnsi="Consolas"/>
           <w:sz w:val="18"/>
         </w:rPr>
-        <w:t xml:space="preserve">    SELECT CustomerID, FirstName + ' ' + LastName AS CustName, Email, PhoneNumber,</w:t>
+        <w:t xml:space="preserve">    Birthday</w:t>
       </w:r>
     </w:p>
     <w:p>
@@ -1571,7 +1524,7 @@
           <w:rFonts w:ascii="Consolas" w:hAnsi="Consolas"/>
           <w:sz w:val="18"/>
         </w:rPr>
-        <w:t xml:space="preserve">        PreferredTable, PreferredServer, PreferredRes, PreferredOrder,</w:t>
+        <w:t>FROM Customers</w:t>
       </w:r>
     </w:p>
     <w:p>
@@ -1583,7 +1536,7 @@
           <w:rFonts w:ascii="Consolas" w:hAnsi="Consolas"/>
           <w:sz w:val="18"/>
         </w:rPr>
-        <w:t xml:space="preserve">        Birthday</w:t>
+        <w:t>WHERE @CustomerID IS NULL OR CustomerID = @CustomerID</w:t>
       </w:r>
     </w:p>
     <w:p>
@@ -1595,43 +1548,7 @@
           <w:rFonts w:ascii="Consolas" w:hAnsi="Consolas"/>
           <w:sz w:val="18"/>
         </w:rPr>
-        <w:t xml:space="preserve">    FROM Customers</w:t>
-      </w:r>
-    </w:p>
-    <w:p>
-      <w:pPr>
-        <w:spacing w:after="0" w:before="0"/>
-      </w:pPr>
-      <w:r>
-        <w:rPr>
-          <w:rFonts w:ascii="Consolas" w:hAnsi="Consolas"/>
-          <w:sz w:val="18"/>
-        </w:rPr>
-        <w:t xml:space="preserve">    WHERE @CustomerID IS NULL OR CustomerID = @CustomerID</w:t>
-      </w:r>
-    </w:p>
-    <w:p>
-      <w:pPr>
-        <w:spacing w:after="0" w:before="0"/>
-      </w:pPr>
-      <w:r>
-        <w:rPr>
-          <w:rFonts w:ascii="Consolas" w:hAnsi="Consolas"/>
-          <w:sz w:val="18"/>
-        </w:rPr>
-        <w:t xml:space="preserve">    ORDER BY CustName ASC;</w:t>
-      </w:r>
-    </w:p>
-    <w:p>
-      <w:pPr>
-        <w:spacing w:after="0" w:before="0"/>
-      </w:pPr>
-      <w:r>
-        <w:rPr>
-          <w:rFonts w:ascii="Consolas" w:hAnsi="Consolas"/>
-          <w:sz w:val="18"/>
-        </w:rPr>
-        <w:t>END;</w:t>
+        <w:t>ORDER BY CustName ASC</w:t>
       </w:r>
     </w:p>
     <w:p/>
@@ -1640,7 +1557,7 @@
         <w:pStyle w:val="Heading3"/>
       </w:pPr>
       <w:r>
-        <w:t>Test - all customers</w:t>
+        <w:t>Test - all customers, then one customer</w:t>
       </w:r>
     </w:p>
     <w:p>
@@ -1651,36 +1568,6 @@
           <w:sz w:val="20"/>
         </w:rPr>
         <w:t>EXEC spN_CustomerDetails;</w:t>
-      </w:r>
-    </w:p>
-    <w:p>
-      <w:pPr>
-        <w:jc w:val="center"/>
-      </w:pPr>
-      <w:r>
-        <w:rPr>
-          <w:b w:val="0"/>
-          <w:i/>
-        </w:rPr>
-        <w:t>[ screenshot 1e_customers.png goes here ]</w:t>
-      </w:r>
-    </w:p>
-    <w:p>
-      <w:r>
-        <w:rPr>
-          <w:b w:val="0"/>
-          <w:i/>
-          <w:sz w:val="20"/>
-        </w:rPr>
-        <w:t>Figure 6: All 100 customers, sorted by name.</w:t>
-      </w:r>
-    </w:p>
-    <w:p>
-      <w:pPr>
-        <w:pStyle w:val="Heading3"/>
-      </w:pPr>
-      <w:r>
-        <w:t>Test - one customer</w:t>
       </w:r>
     </w:p>
     <w:p>
@@ -1698,11 +1585,38 @@
         <w:jc w:val="center"/>
       </w:pPr>
       <w:r>
-        <w:rPr>
-          <w:b w:val="0"/>
-          <w:i/>
-        </w:rPr>
-        <w:t>[ screenshot 1e_customer_one.png goes here ]</w:t>
+        <w:drawing>
+          <wp:inline xmlns:a="http://schemas.openxmlformats.org/drawingml/2006/main" xmlns:pic="http://schemas.openxmlformats.org/drawingml/2006/picture">
+            <wp:extent cx="5943600" cy="4953000"/>
+            <wp:docPr id="6" name="Picture 6"/>
+            <wp:cNvGraphicFramePr>
+              <a:graphicFrameLocks noChangeAspect="1"/>
+            </wp:cNvGraphicFramePr>
+            <a:graphic>
+              <a:graphicData uri="http://schemas.openxmlformats.org/drawingml/2006/picture">
+                <pic:pic>
+                  <pic:nvPicPr>
+                    <pic:cNvPr id="0" name="1e_customers.png"/>
+                    <pic:cNvPicPr/>
+                  </pic:nvPicPr>
+                  <pic:blipFill>
+                    <a:blip r:embed="rId14"/>
+                    <a:stretch>
+                      <a:fillRect/>
+                    </a:stretch>
+                  </pic:blipFill>
+                  <pic:spPr>
+                    <a:xfrm>
+                      <a:off x="0" y="0"/>
+                      <a:ext cx="5943600" cy="4953000"/>
+                    </a:xfrm>
+                    <a:prstGeom prst="rect"/>
+                  </pic:spPr>
+                </pic:pic>
+              </a:graphicData>
+            </a:graphic>
+          </wp:inline>
+        </w:drawing>
       </w:r>
     </w:p>
     <w:p>
@@ -1712,7 +1626,7 @@
           <w:i/>
           <w:sz w:val="20"/>
         </w:rPr>
-        <w:t>Figure 7: One customer returned when an ID is passed.</w:t>
+        <w:t>Figure 6: Top grid: all 100 customers, sorted by name. Bottom grid: only Ciara Reilly comes back when @CustomerID = 1 is passed.</w:t>
       </w:r>
     </w:p>
     <w:sectPr>

</xml_diff>